<commit_message>
docs: update report project
</commit_message>
<xml_diff>
--- a/Annexes/Rapport_de_projet/1501_Rapport.docx
+++ b/Annexes/Rapport_de_projet/1501_Rapport.docx
@@ -753,7 +753,7 @@
                 </w:rPr>
                 <w:fldChar w:fldCharType="separate"/>
               </w:r>
-              <w:hyperlink w:anchor="_Toc219714655" w:history="1">
+              <w:hyperlink w:anchor="_Toc219803971" w:history="1">
                 <w:r>
                   <w:rPr>
                     <w:rStyle w:val="Lienhypertexte"/>
@@ -780,7 +780,7 @@
                     <w:noProof/>
                     <w:webHidden/>
                   </w:rPr>
-                  <w:instrText xml:space="preserve"> PAGEREF _Toc219714655 \h </w:instrText>
+                  <w:instrText xml:space="preserve"> PAGEREF _Toc219803971 \h </w:instrText>
                 </w:r>
                 <w:r>
                   <w:rPr>
@@ -826,7 +826,7 @@
                   <w14:ligatures w14:val="standardContextual"/>
                 </w:rPr>
               </w:pPr>
-              <w:hyperlink w:anchor="_Toc219714656" w:history="1">
+              <w:hyperlink w:anchor="_Toc219803972" w:history="1">
                 <w:r>
                   <w:rPr>
                     <w:rStyle w:val="Lienhypertexte"/>
@@ -853,7 +853,7 @@
                     <w:noProof/>
                     <w:webHidden/>
                   </w:rPr>
-                  <w:instrText xml:space="preserve"> PAGEREF _Toc219714656 \h </w:instrText>
+                  <w:instrText xml:space="preserve"> PAGEREF _Toc219803972 \h </w:instrText>
                 </w:r>
                 <w:r>
                   <w:rPr>
@@ -899,7 +899,7 @@
                   <w14:ligatures w14:val="standardContextual"/>
                 </w:rPr>
               </w:pPr>
-              <w:hyperlink w:anchor="_Toc219714657" w:history="1">
+              <w:hyperlink w:anchor="_Toc219803973" w:history="1">
                 <w:r>
                   <w:rPr>
                     <w:rStyle w:val="Lienhypertexte"/>
@@ -926,7 +926,7 @@
                     <w:noProof/>
                     <w:webHidden/>
                   </w:rPr>
-                  <w:instrText xml:space="preserve"> PAGEREF _Toc219714657 \h </w:instrText>
+                  <w:instrText xml:space="preserve"> PAGEREF _Toc219803973 \h </w:instrText>
                 </w:r>
                 <w:r>
                   <w:rPr>
@@ -972,7 +972,7 @@
                   <w14:ligatures w14:val="standardContextual"/>
                 </w:rPr>
               </w:pPr>
-              <w:hyperlink w:anchor="_Toc219714658" w:history="1">
+              <w:hyperlink w:anchor="_Toc219803974" w:history="1">
                 <w:r>
                   <w:rPr>
                     <w:rStyle w:val="Lienhypertexte"/>
@@ -999,7 +999,7 @@
                     <w:noProof/>
                     <w:webHidden/>
                   </w:rPr>
-                  <w:instrText xml:space="preserve"> PAGEREF _Toc219714658 \h </w:instrText>
+                  <w:instrText xml:space="preserve"> PAGEREF _Toc219803974 \h </w:instrText>
                 </w:r>
                 <w:r>
                   <w:rPr>
@@ -1045,7 +1045,7 @@
                   <w14:ligatures w14:val="standardContextual"/>
                 </w:rPr>
               </w:pPr>
-              <w:hyperlink w:anchor="_Toc219714659" w:history="1">
+              <w:hyperlink w:anchor="_Toc219803975" w:history="1">
                 <w:r>
                   <w:rPr>
                     <w:rStyle w:val="Lienhypertexte"/>
@@ -1072,7 +1072,7 @@
                     <w:noProof/>
                     <w:webHidden/>
                   </w:rPr>
-                  <w:instrText xml:space="preserve"> PAGEREF _Toc219714659 \h </w:instrText>
+                  <w:instrText xml:space="preserve"> PAGEREF _Toc219803975 \h </w:instrText>
                 </w:r>
                 <w:r>
                   <w:rPr>
@@ -1118,7 +1118,7 @@
                   <w14:ligatures w14:val="standardContextual"/>
                 </w:rPr>
               </w:pPr>
-              <w:hyperlink w:anchor="_Toc219714660" w:history="1">
+              <w:hyperlink w:anchor="_Toc219803976" w:history="1">
                 <w:r>
                   <w:rPr>
                     <w:rStyle w:val="Lienhypertexte"/>
@@ -1145,7 +1145,7 @@
                     <w:noProof/>
                     <w:webHidden/>
                   </w:rPr>
-                  <w:instrText xml:space="preserve"> PAGEREF _Toc219714660 \h </w:instrText>
+                  <w:instrText xml:space="preserve"> PAGEREF _Toc219803976 \h </w:instrText>
                 </w:r>
                 <w:r>
                   <w:rPr>
@@ -1191,7 +1191,7 @@
                   <w14:ligatures w14:val="standardContextual"/>
                 </w:rPr>
               </w:pPr>
-              <w:hyperlink w:anchor="_Toc219714661" w:history="1">
+              <w:hyperlink w:anchor="_Toc219803977" w:history="1">
                 <w:r>
                   <w:rPr>
                     <w:rStyle w:val="Lienhypertexte"/>
@@ -1218,7 +1218,7 @@
                     <w:noProof/>
                     <w:webHidden/>
                   </w:rPr>
-                  <w:instrText xml:space="preserve"> PAGEREF _Toc219714661 \h </w:instrText>
+                  <w:instrText xml:space="preserve"> PAGEREF _Toc219803977 \h </w:instrText>
                 </w:r>
                 <w:r>
                   <w:rPr>
@@ -1264,7 +1264,7 @@
                   <w14:ligatures w14:val="standardContextual"/>
                 </w:rPr>
               </w:pPr>
-              <w:hyperlink w:anchor="_Toc219714662" w:history="1">
+              <w:hyperlink w:anchor="_Toc219803978" w:history="1">
                 <w:r>
                   <w:rPr>
                     <w:rStyle w:val="Lienhypertexte"/>
@@ -1291,7 +1291,7 @@
                     <w:noProof/>
                     <w:webHidden/>
                   </w:rPr>
-                  <w:instrText xml:space="preserve"> PAGEREF _Toc219714662 \h </w:instrText>
+                  <w:instrText xml:space="preserve"> PAGEREF _Toc219803978 \h </w:instrText>
                 </w:r>
                 <w:r>
                   <w:rPr>
@@ -1337,7 +1337,7 @@
                   <w14:ligatures w14:val="standardContextual"/>
                 </w:rPr>
               </w:pPr>
-              <w:hyperlink w:anchor="_Toc219714663" w:history="1">
+              <w:hyperlink w:anchor="_Toc219803979" w:history="1">
                 <w:r>
                   <w:rPr>
                     <w:rStyle w:val="Lienhypertexte"/>
@@ -1364,7 +1364,7 @@
                     <w:noProof/>
                     <w:webHidden/>
                   </w:rPr>
-                  <w:instrText xml:space="preserve"> PAGEREF _Toc219714663 \h </w:instrText>
+                  <w:instrText xml:space="preserve"> PAGEREF _Toc219803979 \h </w:instrText>
                 </w:r>
                 <w:r>
                   <w:rPr>
@@ -1410,7 +1410,7 @@
                   <w14:ligatures w14:val="standardContextual"/>
                 </w:rPr>
               </w:pPr>
-              <w:hyperlink w:anchor="_Toc219714664" w:history="1">
+              <w:hyperlink w:anchor="_Toc219803980" w:history="1">
                 <w:r>
                   <w:rPr>
                     <w:rStyle w:val="Lienhypertexte"/>
@@ -1437,7 +1437,7 @@
                     <w:noProof/>
                     <w:webHidden/>
                   </w:rPr>
-                  <w:instrText xml:space="preserve"> PAGEREF _Toc219714664 \h </w:instrText>
+                  <w:instrText xml:space="preserve"> PAGEREF _Toc219803980 \h </w:instrText>
                 </w:r>
                 <w:r>
                   <w:rPr>
@@ -1483,7 +1483,7 @@
                   <w14:ligatures w14:val="standardContextual"/>
                 </w:rPr>
               </w:pPr>
-              <w:hyperlink w:anchor="_Toc219714665" w:history="1">
+              <w:hyperlink w:anchor="_Toc219803981" w:history="1">
                 <w:r>
                   <w:rPr>
                     <w:rStyle w:val="Lienhypertexte"/>
@@ -1510,7 +1510,7 @@
                     <w:noProof/>
                     <w:webHidden/>
                   </w:rPr>
-                  <w:instrText xml:space="preserve"> PAGEREF _Toc219714665 \h </w:instrText>
+                  <w:instrText xml:space="preserve"> PAGEREF _Toc219803981 \h </w:instrText>
                 </w:r>
                 <w:r>
                   <w:rPr>
@@ -1556,7 +1556,7 @@
                   <w14:ligatures w14:val="standardContextual"/>
                 </w:rPr>
               </w:pPr>
-              <w:hyperlink w:anchor="_Toc219714666" w:history="1">
+              <w:hyperlink w:anchor="_Toc219803982" w:history="1">
                 <w:r>
                   <w:rPr>
                     <w:rStyle w:val="Lienhypertexte"/>
@@ -1583,7 +1583,7 @@
                     <w:noProof/>
                     <w:webHidden/>
                   </w:rPr>
-                  <w:instrText xml:space="preserve"> PAGEREF _Toc219714666 \h </w:instrText>
+                  <w:instrText xml:space="preserve"> PAGEREF _Toc219803982 \h </w:instrText>
                 </w:r>
                 <w:r>
                   <w:rPr>
@@ -1629,7 +1629,7 @@
                   <w14:ligatures w14:val="standardContextual"/>
                 </w:rPr>
               </w:pPr>
-              <w:hyperlink w:anchor="_Toc219714667" w:history="1">
+              <w:hyperlink w:anchor="_Toc219803983" w:history="1">
                 <w:r>
                   <w:rPr>
                     <w:rStyle w:val="Lienhypertexte"/>
@@ -1656,7 +1656,7 @@
                     <w:noProof/>
                     <w:webHidden/>
                   </w:rPr>
-                  <w:instrText xml:space="preserve"> PAGEREF _Toc219714667 \h </w:instrText>
+                  <w:instrText xml:space="preserve"> PAGEREF _Toc219803983 \h </w:instrText>
                 </w:r>
                 <w:r>
                   <w:rPr>
@@ -1677,6 +1677,79 @@
                     <w:webHidden/>
                   </w:rPr>
                   <w:t>2</w:t>
+                </w:r>
+                <w:r>
+                  <w:rPr>
+                    <w:noProof/>
+                    <w:webHidden/>
+                  </w:rPr>
+                  <w:fldChar w:fldCharType="end"/>
+                </w:r>
+              </w:hyperlink>
+            </w:p>
+            <w:p>
+              <w:pPr>
+                <w:pStyle w:val="TM3"/>
+                <w:tabs>
+                  <w:tab w:val="right" w:leader="dot" w:pos="9062"/>
+                </w:tabs>
+                <w:rPr>
+                  <w:noProof/>
+                  <w:kern w:val="2"/>
+                  <w:sz w:val="24"/>
+                  <w:szCs w:val="24"/>
+                  <w:lang w:eastAsia="fr-CH"/>
+                  <w14:ligatures w14:val="standardContextual"/>
+                </w:rPr>
+              </w:pPr>
+              <w:hyperlink w:anchor="_Toc219803984" w:history="1">
+                <w:r>
+                  <w:rPr>
+                    <w:rStyle w:val="Lienhypertexte"/>
+                    <w:noProof/>
+                  </w:rPr>
+                  <w:t>Tâche 6</w:t>
+                </w:r>
+                <w:r>
+                  <w:rPr>
+                    <w:noProof/>
+                    <w:webHidden/>
+                  </w:rPr>
+                  <w:tab/>
+                </w:r>
+                <w:r>
+                  <w:rPr>
+                    <w:noProof/>
+                    <w:webHidden/>
+                  </w:rPr>
+                  <w:fldChar w:fldCharType="begin"/>
+                </w:r>
+                <w:r>
+                  <w:rPr>
+                    <w:noProof/>
+                    <w:webHidden/>
+                  </w:rPr>
+                  <w:instrText xml:space="preserve"> PAGEREF _Toc219803984 \h </w:instrText>
+                </w:r>
+                <w:r>
+                  <w:rPr>
+                    <w:noProof/>
+                    <w:webHidden/>
+                  </w:rPr>
+                </w:r>
+                <w:r>
+                  <w:rPr>
+                    <w:noProof/>
+                    <w:webHidden/>
+                  </w:rPr>
+                  <w:fldChar w:fldCharType="separate"/>
+                </w:r>
+                <w:r>
+                  <w:rPr>
+                    <w:noProof/>
+                    <w:webHidden/>
+                  </w:rPr>
+                  <w:t>3</w:t>
                 </w:r>
                 <w:r>
                   <w:rPr>
@@ -1702,7 +1775,7 @@
                   <w14:ligatures w14:val="standardContextual"/>
                 </w:rPr>
               </w:pPr>
-              <w:hyperlink w:anchor="_Toc219714668" w:history="1">
+              <w:hyperlink w:anchor="_Toc219803985" w:history="1">
                 <w:r>
                   <w:rPr>
                     <w:rStyle w:val="Lienhypertexte"/>
@@ -1729,7 +1802,7 @@
                     <w:noProof/>
                     <w:webHidden/>
                   </w:rPr>
-                  <w:instrText xml:space="preserve"> PAGEREF _Toc219714668 \h </w:instrText>
+                  <w:instrText xml:space="preserve"> PAGEREF _Toc219803985 \h </w:instrText>
                 </w:r>
                 <w:r>
                   <w:rPr>
@@ -1775,7 +1848,7 @@
                   <w14:ligatures w14:val="standardContextual"/>
                 </w:rPr>
               </w:pPr>
-              <w:hyperlink w:anchor="_Toc219714669" w:history="1">
+              <w:hyperlink w:anchor="_Toc219803986" w:history="1">
                 <w:r>
                   <w:rPr>
                     <w:rStyle w:val="Lienhypertexte"/>
@@ -1802,7 +1875,7 @@
                     <w:noProof/>
                     <w:webHidden/>
                   </w:rPr>
-                  <w:instrText xml:space="preserve"> PAGEREF _Toc219714669 \h </w:instrText>
+                  <w:instrText xml:space="preserve"> PAGEREF _Toc219803986 \h </w:instrText>
                 </w:r>
                 <w:r>
                   <w:rPr>
@@ -1848,7 +1921,7 @@
                   <w14:ligatures w14:val="standardContextual"/>
                 </w:rPr>
               </w:pPr>
-              <w:hyperlink w:anchor="_Toc219714670" w:history="1">
+              <w:hyperlink w:anchor="_Toc219803987" w:history="1">
                 <w:r>
                   <w:rPr>
                     <w:rStyle w:val="Lienhypertexte"/>
@@ -1875,7 +1948,7 @@
                     <w:noProof/>
                     <w:webHidden/>
                   </w:rPr>
-                  <w:instrText xml:space="preserve"> PAGEREF _Toc219714670 \h </w:instrText>
+                  <w:instrText xml:space="preserve"> PAGEREF _Toc219803987 \h </w:instrText>
                 </w:r>
                 <w:r>
                   <w:rPr>
@@ -1921,7 +1994,7 @@
                   <w14:ligatures w14:val="standardContextual"/>
                 </w:rPr>
               </w:pPr>
-              <w:hyperlink w:anchor="_Toc219714671" w:history="1">
+              <w:hyperlink w:anchor="_Toc219803988" w:history="1">
                 <w:r>
                   <w:rPr>
                     <w:rStyle w:val="Lienhypertexte"/>
@@ -1948,7 +2021,7 @@
                     <w:noProof/>
                     <w:webHidden/>
                   </w:rPr>
-                  <w:instrText xml:space="preserve"> PAGEREF _Toc219714671 \h </w:instrText>
+                  <w:instrText xml:space="preserve"> PAGEREF _Toc219803988 \h </w:instrText>
                 </w:r>
                 <w:r>
                   <w:rPr>
@@ -2002,7 +2075,7 @@
       <w:pPr>
         <w:pStyle w:val="Titre1"/>
       </w:pPr>
-      <w:bookmarkStart w:id="0" w:name="_Toc219714655"/>
+      <w:bookmarkStart w:id="0" w:name="_Toc219803971"/>
       <w:r>
         <w:lastRenderedPageBreak/>
         <w:t>Rapport hebdomadaire d’avance de projet</w:t>
@@ -2013,7 +2086,7 @@
       <w:pPr>
         <w:pStyle w:val="Titre2"/>
       </w:pPr>
-      <w:bookmarkStart w:id="1" w:name="_Toc219714656"/>
+      <w:bookmarkStart w:id="1" w:name="_Toc219803972"/>
       <w:r>
         <w:t>Informations générales</w:t>
       </w:r>
@@ -2191,7 +2264,7 @@
       <w:pPr>
         <w:pStyle w:val="Titre2"/>
       </w:pPr>
-      <w:bookmarkStart w:id="2" w:name="_Toc219714657"/>
+      <w:bookmarkStart w:id="2" w:name="_Toc219803973"/>
       <w:r>
         <w:t>Résumé de la semaine</w:t>
       </w:r>
@@ -2201,7 +2274,7 @@
       <w:pPr>
         <w:pStyle w:val="Titre3"/>
       </w:pPr>
-      <w:bookmarkStart w:id="3" w:name="_Toc219714658"/>
+      <w:bookmarkStart w:id="3" w:name="_Toc219803974"/>
       <w:r>
         <w:t>Avancement global</w:t>
       </w:r>
@@ -2219,7 +2292,7 @@
       <w:pPr>
         <w:pStyle w:val="Titre3"/>
       </w:pPr>
-      <w:bookmarkStart w:id="4" w:name="_Toc219714659"/>
+      <w:bookmarkStart w:id="4" w:name="_Toc219803975"/>
       <w:r>
         <w:t>Événements marquants</w:t>
       </w:r>
@@ -2237,7 +2310,7 @@
       <w:pPr>
         <w:pStyle w:val="Titre3"/>
       </w:pPr>
-      <w:bookmarkStart w:id="5" w:name="_Toc219714660"/>
+      <w:bookmarkStart w:id="5" w:name="_Toc219803976"/>
       <w:r>
         <w:t>Points d’attention</w:t>
       </w:r>
@@ -2252,7 +2325,7 @@
       <w:pPr>
         <w:pStyle w:val="Titre2"/>
       </w:pPr>
-      <w:bookmarkStart w:id="6" w:name="_Toc219714661"/>
+      <w:bookmarkStart w:id="6" w:name="_Toc219803977"/>
       <w:r>
         <w:t>Tâches réalisées</w:t>
       </w:r>
@@ -2352,7 +2425,7 @@
       <w:pPr>
         <w:pStyle w:val="Titre2"/>
       </w:pPr>
-      <w:bookmarkStart w:id="7" w:name="_Toc219714662"/>
+      <w:bookmarkStart w:id="7" w:name="_Toc219803978"/>
       <w:r>
         <w:t>Tâches en cours</w:t>
       </w:r>
@@ -2362,7 +2435,7 @@
       <w:pPr>
         <w:pStyle w:val="Titre3"/>
       </w:pPr>
-      <w:bookmarkStart w:id="8" w:name="_Toc219714663"/>
+      <w:bookmarkStart w:id="8" w:name="_Toc219803979"/>
       <w:r>
         <w:t>Tâche 1</w:t>
       </w:r>
@@ -2377,7 +2450,7 @@
       <w:pPr>
         <w:pStyle w:val="Titre3"/>
       </w:pPr>
-      <w:bookmarkStart w:id="9" w:name="_Toc219714664"/>
+      <w:bookmarkStart w:id="9" w:name="_Toc219803980"/>
       <w:r>
         <w:t>Tâche 2</w:t>
       </w:r>
@@ -2392,7 +2465,7 @@
       <w:pPr>
         <w:pStyle w:val="Titre3"/>
       </w:pPr>
-      <w:bookmarkStart w:id="10" w:name="_Toc219714665"/>
+      <w:bookmarkStart w:id="10" w:name="_Toc219803981"/>
       <w:r>
         <w:t>Tâche 3</w:t>
       </w:r>
@@ -2410,7 +2483,7 @@
       <w:pPr>
         <w:pStyle w:val="Titre3"/>
       </w:pPr>
-      <w:bookmarkStart w:id="11" w:name="_Toc219714666"/>
+      <w:bookmarkStart w:id="11" w:name="_Toc219803982"/>
       <w:r>
         <w:t>Tâche 4</w:t>
       </w:r>
@@ -2428,7 +2501,7 @@
       <w:pPr>
         <w:pStyle w:val="Titre3"/>
       </w:pPr>
-      <w:bookmarkStart w:id="12" w:name="_Toc219714667"/>
+      <w:bookmarkStart w:id="12" w:name="_Toc219803983"/>
       <w:r>
         <w:t>Tâche 5</w:t>
       </w:r>
@@ -2444,9 +2517,11 @@
       <w:pPr>
         <w:pStyle w:val="Titre3"/>
       </w:pPr>
+      <w:bookmarkStart w:id="13" w:name="_Toc219803984"/>
       <w:r>
         <w:t>Tâche 6</w:t>
       </w:r>
+      <w:bookmarkEnd w:id="13"/>
     </w:p>
     <w:p>
       <w:r>
@@ -2457,11 +2532,11 @@
       <w:pPr>
         <w:pStyle w:val="Titre2"/>
       </w:pPr>
-      <w:bookmarkStart w:id="13" w:name="_Toc219714668"/>
+      <w:bookmarkStart w:id="14" w:name="_Toc219803985"/>
       <w:r>
         <w:t>Tâches prévues pour la semaine suivante</w:t>
       </w:r>
-      <w:bookmarkEnd w:id="13"/>
+      <w:bookmarkEnd w:id="14"/>
     </w:p>
     <w:p>
       <w:pPr>
@@ -2538,21 +2613,21 @@
       <w:pPr>
         <w:pStyle w:val="Titre2"/>
       </w:pPr>
-      <w:bookmarkStart w:id="14" w:name="_Toc219714669"/>
+      <w:bookmarkStart w:id="15" w:name="_Toc219803986"/>
       <w:r>
         <w:t>Risques &amp; dépendances</w:t>
       </w:r>
-      <w:bookmarkEnd w:id="14"/>
+      <w:bookmarkEnd w:id="15"/>
     </w:p>
     <w:p>
       <w:pPr>
         <w:pStyle w:val="Titre3"/>
       </w:pPr>
-      <w:bookmarkStart w:id="15" w:name="_Toc219714670"/>
+      <w:bookmarkStart w:id="16" w:name="_Toc219803987"/>
       <w:r>
         <w:t>Problème / Risque : Manque de maîtrise de la technologie utilisée par une partie de l’équipe</w:t>
       </w:r>
-      <w:bookmarkEnd w:id="15"/>
+      <w:bookmarkEnd w:id="16"/>
     </w:p>
     <w:p>
       <w:r>
@@ -2600,11 +2675,11 @@
       <w:pPr>
         <w:pStyle w:val="Titre2"/>
       </w:pPr>
-      <w:bookmarkStart w:id="16" w:name="_Toc219714671"/>
+      <w:bookmarkStart w:id="17" w:name="_Toc219803988"/>
       <w:r>
         <w:t>Indicateurs clés</w:t>
       </w:r>
-      <w:bookmarkEnd w:id="16"/>
+      <w:bookmarkEnd w:id="17"/>
     </w:p>
     <w:p>
       <w:pPr>
@@ -2618,23 +2693,21 @@
           <w:b/>
           <w:bCs/>
         </w:rPr>
-        <w:t xml:space="preserve">Avancement </w:t>
-      </w:r>
-      <w:proofErr w:type="spellStart"/>
+        <w:t>Avancement g</w:t>
+      </w:r>
       <w:r>
         <w:rPr>
           <w:b/>
           <w:bCs/>
         </w:rPr>
-        <w:t>gobal</w:t>
-      </w:r>
-      <w:proofErr w:type="spellEnd"/>
+        <w:t>l</w:t>
+      </w:r>
       <w:r>
         <w:rPr>
           <w:b/>
           <w:bCs/>
         </w:rPr>
-        <w:t> :</w:t>
+        <w:t>obal :</w:t>
       </w:r>
     </w:p>
     <w:p>
@@ -2899,7 +2972,7 @@
       <w:rPr>
         <w:noProof/>
       </w:rPr>
-      <w:t>19.01.2026</w:t>
+      <w:t>20.01.2026</w:t>
     </w:r>
     <w:r>
       <w:fldChar w:fldCharType="end"/>

</xml_diff>